<commit_message>
Actualiza niveles Tec Plantilla 1
</commit_message>
<xml_diff>
--- a/plantillas/Plantilla_1_FichaNecesidad.docx
+++ b/plantillas/Plantilla_1_FichaNecesidad.docx
@@ -1794,7 +1794,7 @@
                 <w:b/>
                 <w:bCs/>
               </w:rPr>
-              <w:t xml:space="preserve">3 - Sólido</w:t>
+              <w:t xml:space="preserve">4 - Destacado</w:t>
             </w:r>
           </w:p>
         </w:tc>
@@ -1836,7 +1836,7 @@
                 <w:b/>
                 <w:bCs/>
               </w:rPr>
-              <w:t xml:space="preserve">2 - En desarrollo</w:t>
+              <w:t xml:space="preserve">3 - Sólido</w:t>
             </w:r>
           </w:p>
         </w:tc>
@@ -1887,7 +1887,7 @@
                 <w:b/>
                 <w:bCs/>
               </w:rPr>
-              <w:t xml:space="preserve">1 - Inicial</w:t>
+              <w:t xml:space="preserve">2 - Básico</w:t>
             </w:r>
           </w:p>
         </w:tc>
@@ -2033,7 +2033,7 @@
                 <w:b/>
                 <w:bCs/>
               </w:rPr>
-              <w:t xml:space="preserve">3 - Sólido</w:t>
+              <w:t xml:space="preserve">4 - Destacado</w:t>
             </w:r>
           </w:p>
         </w:tc>
@@ -2075,7 +2075,7 @@
                 <w:b/>
                 <w:bCs/>
               </w:rPr>
-              <w:t xml:space="preserve">2 - En desarrollo</w:t>
+              <w:t xml:space="preserve">3 - Sólido</w:t>
             </w:r>
           </w:p>
         </w:tc>
@@ -2117,7 +2117,7 @@
                 <w:b/>
                 <w:bCs/>
               </w:rPr>
-              <w:t xml:space="preserve">1 - Inicial</w:t>
+              <w:t xml:space="preserve">2 - Básico</w:t>
             </w:r>
           </w:p>
         </w:tc>
@@ -2257,7 +2257,7 @@
                 <w:b/>
                 <w:bCs/>
               </w:rPr>
-              <w:t xml:space="preserve">3 - Sólido</w:t>
+              <w:t xml:space="preserve">4 - Destacado</w:t>
             </w:r>
           </w:p>
         </w:tc>
@@ -2299,7 +2299,7 @@
                 <w:b/>
                 <w:bCs/>
               </w:rPr>
-              <w:t xml:space="preserve">2 - En desarrollo</w:t>
+              <w:t xml:space="preserve">3 - Sólido</w:t>
             </w:r>
           </w:p>
         </w:tc>
@@ -2341,7 +2341,7 @@
                 <w:b/>
                 <w:bCs/>
               </w:rPr>
-              <w:t xml:space="preserve">1 - Inicial</w:t>
+              <w:t xml:space="preserve">2 - Básico</w:t>
             </w:r>
           </w:p>
         </w:tc>

</xml_diff>